<commit_message>
Expand article methodology and results document
</commit_message>
<xml_diff>
--- a/docs/articulo_CITREN_leite_materiales_resultados.docx
+++ b/docs/articulo_CITREN_leite_materiales_resultados.docx
@@ -348,7 +348,7 @@
           <w:i w:val="0"/>
           <w:sz w:val="20"/>
         </w:rPr>
-        <w:t>El estudio fue desarrollado como un experimento computacional de predicción supervisada para estimar la producción anual de leche de los municipios del estado de Paraná, Brasil. La unidad de observación fue el municipio-año y la variable dependiente fue la producción municipal de leche, expresada en mil litros. La propuesta metodológica se basó en la integración de datos agropecuarios públicos con variables agroclimáticas anuales, seguida por la comparación entre un modelo base y dos algoritmos de aprendizaje automático.</w:t>
+        <w:t>El estudio fue desarrollado como un experimento computacional de predicción supervisada para estimar la producción anual de leche de los municipios del estado de Paraná, Brasil. La unidad de observación fue el municipio-año y la variable dependiente fue la producción municipal de leche, expresada en mil litros. La propuesta metodológica se basó en la integración de datos agropecuarios públicos con variables agroclimáticas anuales, seguida por la comparación entre un modelo base temporal y dos algoritmos de aprendizaje automático.</w:t>
       </w:r>
     </w:p>
     <w:p>
@@ -359,7 +359,538 @@
           <w:i w:val="0"/>
           <w:sz w:val="20"/>
         </w:rPr>
-        <w:t>El flujo experimental fue organizado en cinco etapas: recopilación de las bases públicas; limpieza y estandarización de los registros; construcción de variables temporales y climáticas; entrenamiento y ajuste de los algoritmos; y evaluación comparativa mediante métricas de regresión. Aunque se analizaron otras bases públicas para etapas futuras de investigación, como MapBiomas, TOPODATA, CAR, SIGEF, red vial, CHIRPS, ANA/HidroWeb e hidrografía, estas no fueron utilizadas en los modelos presentados en este artículo, pues el alcance del congreso fue una versión simplificada centrada en predicción municipal anual.</w:t>
+        <w:t>El flujo experimental fue organizado en cinco etapas: recopilación de bases públicas; limpieza y estandarización de registros; construcción de variables temporales y climáticas; entrenamiento y ajuste de algoritmos; y evaluación comparativa mediante métricas de regresión. Esta organización permite que el experimento sea reproducible y que cada resultado pueda ser rastreado hasta el archivo utilizado en el procesamiento.</w:t>
+      </w:r>
+    </w:p>
+    <w:p>
+      <w:r>
+        <w:rPr>
+          <w:rFonts w:ascii="Times New Roman" w:hAnsi="Times New Roman" w:eastAsia="Times New Roman"/>
+          <w:b w:val="0"/>
+          <w:i w:val="0"/>
+          <w:sz w:val="20"/>
+        </w:rPr>
+        <w:t>Aunque se analizaron otras bases públicas para etapas futuras de investigación, como MapBiomas, TOPODATA, CAR, SIGEF, red vial, CHIRPS, ANA/HidroWeb e hidrografía, estas no fueron utilizadas en los modelos presentados en este artículo. La decisión metodológica se justifica porque el objetivo del artículo de congreso fue producir una versión más directa, basada en datos tabulares públicos, enfocada en predicción municipal anual y no en simulación espacial de propiedades, rutas o logística de recolección.</w:t>
+      </w:r>
+    </w:p>
+    <w:p>
+      <w:r>
+        <w:rPr>
+          <w:rFonts w:ascii="Times New Roman" w:hAnsi="Times New Roman" w:eastAsia="Times New Roman"/>
+          <w:b w:val="0"/>
+          <w:i w:val="0"/>
+          <w:sz w:val="20"/>
+        </w:rPr>
+        <w:t>Fuentes públicas de datos</w:t>
+      </w:r>
+    </w:p>
+    <w:tbl>
+      <w:tblPr>
+        <w:tblW w:type="auto" w:w="0"/>
+        <w:tblLayout w:type="autofit"/>
+        <w:tblLook w:firstColumn="1" w:firstRow="1" w:lastColumn="0" w:lastRow="0" w:noHBand="0" w:noVBand="1" w:val="04A0"/>
+      </w:tblPr>
+      <w:tblGrid>
+        <w:gridCol w:w="2268"/>
+        <w:gridCol w:w="2268"/>
+        <w:gridCol w:w="2268"/>
+        <w:gridCol w:w="2268"/>
+      </w:tblGrid>
+      <w:tr>
+        <w:tc>
+          <w:tcPr>
+            <w:tcW w:type="dxa" w:w="2268"/>
+            <w:vAlign w:val="center"/>
+            <w:shd w:fill="D9EAD3"/>
+            <w:tcBorders>
+              <w:top w:val="single" w:sz="4" w:space="0" w:color="7F7F7F"/>
+              <w:left w:val="single" w:sz="4" w:space="0" w:color="7F7F7F"/>
+              <w:bottom w:val="single" w:sz="4" w:space="0" w:color="7F7F7F"/>
+              <w:right w:val="single" w:sz="4" w:space="0" w:color="7F7F7F"/>
+              <w:insideH w:val="single" w:sz="4" w:space="0" w:color="7F7F7F"/>
+              <w:insideV w:val="single" w:sz="4" w:space="0" w:color="7F7F7F"/>
+            </w:tcBorders>
+          </w:tcPr>
+          <w:p>
+            <w:pPr>
+              <w:spacing w:after="0" w:line="240" w:lineRule="auto"/>
+              <w:ind w:firstLine="0"/>
+            </w:pPr>
+            <w:r>
+              <w:rPr>
+                <w:rFonts w:ascii="Times New Roman" w:hAnsi="Times New Roman" w:eastAsia="Times New Roman"/>
+                <w:b/>
+                <w:i w:val="0"/>
+                <w:sz w:val="14"/>
+              </w:rPr>
+              <w:t>Base</w:t>
+            </w:r>
+          </w:p>
+        </w:tc>
+        <w:tc>
+          <w:tcPr>
+            <w:tcW w:type="dxa" w:w="2268"/>
+            <w:vAlign w:val="center"/>
+            <w:shd w:fill="D9EAD3"/>
+            <w:tcBorders>
+              <w:top w:val="single" w:sz="4" w:space="0" w:color="7F7F7F"/>
+              <w:left w:val="single" w:sz="4" w:space="0" w:color="7F7F7F"/>
+              <w:bottom w:val="single" w:sz="4" w:space="0" w:color="7F7F7F"/>
+              <w:right w:val="single" w:sz="4" w:space="0" w:color="7F7F7F"/>
+              <w:insideH w:val="single" w:sz="4" w:space="0" w:color="7F7F7F"/>
+              <w:insideV w:val="single" w:sz="4" w:space="0" w:color="7F7F7F"/>
+            </w:tcBorders>
+          </w:tcPr>
+          <w:p>
+            <w:pPr>
+              <w:spacing w:after="0" w:line="240" w:lineRule="auto"/>
+              <w:ind w:firstLine="0"/>
+            </w:pPr>
+            <w:r>
+              <w:rPr>
+                <w:rFonts w:ascii="Times New Roman" w:hAnsi="Times New Roman" w:eastAsia="Times New Roman"/>
+                <w:b/>
+                <w:i w:val="0"/>
+                <w:sz w:val="14"/>
+              </w:rPr>
+              <w:t>Institución</w:t>
+            </w:r>
+          </w:p>
+        </w:tc>
+        <w:tc>
+          <w:tcPr>
+            <w:tcW w:type="dxa" w:w="2268"/>
+            <w:vAlign w:val="center"/>
+            <w:shd w:fill="D9EAD3"/>
+            <w:tcBorders>
+              <w:top w:val="single" w:sz="4" w:space="0" w:color="7F7F7F"/>
+              <w:left w:val="single" w:sz="4" w:space="0" w:color="7F7F7F"/>
+              <w:bottom w:val="single" w:sz="4" w:space="0" w:color="7F7F7F"/>
+              <w:right w:val="single" w:sz="4" w:space="0" w:color="7F7F7F"/>
+              <w:insideH w:val="single" w:sz="4" w:space="0" w:color="7F7F7F"/>
+              <w:insideV w:val="single" w:sz="4" w:space="0" w:color="7F7F7F"/>
+            </w:tcBorders>
+          </w:tcPr>
+          <w:p>
+            <w:pPr>
+              <w:spacing w:after="0" w:line="240" w:lineRule="auto"/>
+              <w:ind w:firstLine="0"/>
+            </w:pPr>
+            <w:r>
+              <w:rPr>
+                <w:rFonts w:ascii="Times New Roman" w:hAnsi="Times New Roman" w:eastAsia="Times New Roman"/>
+                <w:b/>
+                <w:i w:val="0"/>
+                <w:sz w:val="14"/>
+              </w:rPr>
+              <w:t>Enlace</w:t>
+            </w:r>
+          </w:p>
+        </w:tc>
+        <w:tc>
+          <w:tcPr>
+            <w:tcW w:type="dxa" w:w="2268"/>
+            <w:vAlign w:val="center"/>
+            <w:shd w:fill="D9EAD3"/>
+            <w:tcBorders>
+              <w:top w:val="single" w:sz="4" w:space="0" w:color="7F7F7F"/>
+              <w:left w:val="single" w:sz="4" w:space="0" w:color="7F7F7F"/>
+              <w:bottom w:val="single" w:sz="4" w:space="0" w:color="7F7F7F"/>
+              <w:right w:val="single" w:sz="4" w:space="0" w:color="7F7F7F"/>
+              <w:insideH w:val="single" w:sz="4" w:space="0" w:color="7F7F7F"/>
+              <w:insideV w:val="single" w:sz="4" w:space="0" w:color="7F7F7F"/>
+            </w:tcBorders>
+          </w:tcPr>
+          <w:p>
+            <w:pPr>
+              <w:spacing w:after="0" w:line="240" w:lineRule="auto"/>
+              <w:ind w:firstLine="0"/>
+            </w:pPr>
+            <w:r>
+              <w:rPr>
+                <w:rFonts w:ascii="Times New Roman" w:hAnsi="Times New Roman" w:eastAsia="Times New Roman"/>
+                <w:b/>
+                <w:i w:val="0"/>
+                <w:sz w:val="14"/>
+              </w:rPr>
+              <w:t>Uso en el artículo</w:t>
+            </w:r>
+          </w:p>
+        </w:tc>
+      </w:tr>
+      <w:tr>
+        <w:tc>
+          <w:tcPr>
+            <w:tcW w:type="dxa" w:w="2268"/>
+            <w:vAlign w:val="center"/>
+            <w:tcBorders>
+              <w:top w:val="single" w:sz="4" w:space="0" w:color="7F7F7F"/>
+              <w:left w:val="single" w:sz="4" w:space="0" w:color="7F7F7F"/>
+              <w:bottom w:val="single" w:sz="4" w:space="0" w:color="7F7F7F"/>
+              <w:right w:val="single" w:sz="4" w:space="0" w:color="7F7F7F"/>
+              <w:insideH w:val="single" w:sz="4" w:space="0" w:color="7F7F7F"/>
+              <w:insideV w:val="single" w:sz="4" w:space="0" w:color="7F7F7F"/>
+            </w:tcBorders>
+          </w:tcPr>
+          <w:p>
+            <w:pPr>
+              <w:spacing w:after="0" w:line="240" w:lineRule="auto"/>
+              <w:ind w:firstLine="0"/>
+            </w:pPr>
+            <w:r>
+              <w:rPr>
+                <w:rFonts w:ascii="Times New Roman" w:hAnsi="Times New Roman" w:eastAsia="Times New Roman"/>
+                <w:b w:val="0"/>
+                <w:i w:val="0"/>
+                <w:sz w:val="14"/>
+              </w:rPr>
+              <w:t>Producción de leche municipal</w:t>
+            </w:r>
+          </w:p>
+        </w:tc>
+        <w:tc>
+          <w:tcPr>
+            <w:tcW w:type="dxa" w:w="2268"/>
+            <w:vAlign w:val="center"/>
+            <w:tcBorders>
+              <w:top w:val="single" w:sz="4" w:space="0" w:color="7F7F7F"/>
+              <w:left w:val="single" w:sz="4" w:space="0" w:color="7F7F7F"/>
+              <w:bottom w:val="single" w:sz="4" w:space="0" w:color="7F7F7F"/>
+              <w:right w:val="single" w:sz="4" w:space="0" w:color="7F7F7F"/>
+              <w:insideH w:val="single" w:sz="4" w:space="0" w:color="7F7F7F"/>
+              <w:insideV w:val="single" w:sz="4" w:space="0" w:color="7F7F7F"/>
+            </w:tcBorders>
+          </w:tcPr>
+          <w:p>
+            <w:pPr>
+              <w:spacing w:after="0" w:line="240" w:lineRule="auto"/>
+              <w:ind w:firstLine="0"/>
+            </w:pPr>
+            <w:r>
+              <w:rPr>
+                <w:rFonts w:ascii="Times New Roman" w:hAnsi="Times New Roman" w:eastAsia="Times New Roman"/>
+                <w:b w:val="0"/>
+                <w:i w:val="0"/>
+                <w:sz w:val="14"/>
+              </w:rPr>
+              <w:t>IBGE/SIDRA - Pesquisa da Pecuária Municipal</w:t>
+            </w:r>
+          </w:p>
+        </w:tc>
+        <w:tc>
+          <w:tcPr>
+            <w:tcW w:type="dxa" w:w="2268"/>
+            <w:vAlign w:val="center"/>
+            <w:tcBorders>
+              <w:top w:val="single" w:sz="4" w:space="0" w:color="7F7F7F"/>
+              <w:left w:val="single" w:sz="4" w:space="0" w:color="7F7F7F"/>
+              <w:bottom w:val="single" w:sz="4" w:space="0" w:color="7F7F7F"/>
+              <w:right w:val="single" w:sz="4" w:space="0" w:color="7F7F7F"/>
+              <w:insideH w:val="single" w:sz="4" w:space="0" w:color="7F7F7F"/>
+              <w:insideV w:val="single" w:sz="4" w:space="0" w:color="7F7F7F"/>
+            </w:tcBorders>
+          </w:tcPr>
+          <w:p>
+            <w:pPr>
+              <w:spacing w:after="0" w:line="240" w:lineRule="auto"/>
+              <w:ind w:firstLine="0"/>
+            </w:pPr>
+            <w:r>
+              <w:rPr>
+                <w:rFonts w:ascii="Times New Roman" w:hAnsi="Times New Roman" w:eastAsia="Times New Roman"/>
+                <w:b w:val="0"/>
+                <w:i w:val="0"/>
+                <w:sz w:val="14"/>
+              </w:rPr>
+              <w:t>https://sidra.ibge.gov.br/tabela/74</w:t>
+            </w:r>
+          </w:p>
+        </w:tc>
+        <w:tc>
+          <w:tcPr>
+            <w:tcW w:type="dxa" w:w="2268"/>
+            <w:vAlign w:val="center"/>
+            <w:tcBorders>
+              <w:top w:val="single" w:sz="4" w:space="0" w:color="7F7F7F"/>
+              <w:left w:val="single" w:sz="4" w:space="0" w:color="7F7F7F"/>
+              <w:bottom w:val="single" w:sz="4" w:space="0" w:color="7F7F7F"/>
+              <w:right w:val="single" w:sz="4" w:space="0" w:color="7F7F7F"/>
+              <w:insideH w:val="single" w:sz="4" w:space="0" w:color="7F7F7F"/>
+              <w:insideV w:val="single" w:sz="4" w:space="0" w:color="7F7F7F"/>
+            </w:tcBorders>
+          </w:tcPr>
+          <w:p>
+            <w:pPr>
+              <w:spacing w:after="0" w:line="240" w:lineRule="auto"/>
+              <w:ind w:firstLine="0"/>
+            </w:pPr>
+            <w:r>
+              <w:rPr>
+                <w:rFonts w:ascii="Times New Roman" w:hAnsi="Times New Roman" w:eastAsia="Times New Roman"/>
+                <w:b w:val="0"/>
+                <w:i w:val="0"/>
+                <w:sz w:val="14"/>
+              </w:rPr>
+              <w:t>Variable respuesta anual por municipio, en mil litros.</w:t>
+            </w:r>
+          </w:p>
+        </w:tc>
+      </w:tr>
+      <w:tr>
+        <w:tc>
+          <w:tcPr>
+            <w:tcW w:type="dxa" w:w="2268"/>
+            <w:vAlign w:val="center"/>
+            <w:tcBorders>
+              <w:top w:val="single" w:sz="4" w:space="0" w:color="7F7F7F"/>
+              <w:left w:val="single" w:sz="4" w:space="0" w:color="7F7F7F"/>
+              <w:bottom w:val="single" w:sz="4" w:space="0" w:color="7F7F7F"/>
+              <w:right w:val="single" w:sz="4" w:space="0" w:color="7F7F7F"/>
+              <w:insideH w:val="single" w:sz="4" w:space="0" w:color="7F7F7F"/>
+              <w:insideV w:val="single" w:sz="4" w:space="0" w:color="7F7F7F"/>
+            </w:tcBorders>
+          </w:tcPr>
+          <w:p>
+            <w:pPr>
+              <w:spacing w:after="0" w:line="240" w:lineRule="auto"/>
+              <w:ind w:firstLine="0"/>
+            </w:pPr>
+            <w:r>
+              <w:rPr>
+                <w:rFonts w:ascii="Times New Roman" w:hAnsi="Times New Roman" w:eastAsia="Times New Roman"/>
+                <w:b w:val="0"/>
+                <w:i w:val="0"/>
+                <w:sz w:val="14"/>
+              </w:rPr>
+              <w:t>Datos meteorológicos históricos</w:t>
+            </w:r>
+          </w:p>
+        </w:tc>
+        <w:tc>
+          <w:tcPr>
+            <w:tcW w:type="dxa" w:w="2268"/>
+            <w:vAlign w:val="center"/>
+            <w:tcBorders>
+              <w:top w:val="single" w:sz="4" w:space="0" w:color="7F7F7F"/>
+              <w:left w:val="single" w:sz="4" w:space="0" w:color="7F7F7F"/>
+              <w:bottom w:val="single" w:sz="4" w:space="0" w:color="7F7F7F"/>
+              <w:right w:val="single" w:sz="4" w:space="0" w:color="7F7F7F"/>
+              <w:insideH w:val="single" w:sz="4" w:space="0" w:color="7F7F7F"/>
+              <w:insideV w:val="single" w:sz="4" w:space="0" w:color="7F7F7F"/>
+            </w:tcBorders>
+          </w:tcPr>
+          <w:p>
+            <w:pPr>
+              <w:spacing w:after="0" w:line="240" w:lineRule="auto"/>
+              <w:ind w:firstLine="0"/>
+            </w:pPr>
+            <w:r>
+              <w:rPr>
+                <w:rFonts w:ascii="Times New Roman" w:hAnsi="Times New Roman" w:eastAsia="Times New Roman"/>
+                <w:b w:val="0"/>
+                <w:i w:val="0"/>
+                <w:sz w:val="14"/>
+              </w:rPr>
+              <w:t>INMET - estación automática A819 Castro/PR</w:t>
+            </w:r>
+          </w:p>
+        </w:tc>
+        <w:tc>
+          <w:tcPr>
+            <w:tcW w:type="dxa" w:w="2268"/>
+            <w:vAlign w:val="center"/>
+            <w:tcBorders>
+              <w:top w:val="single" w:sz="4" w:space="0" w:color="7F7F7F"/>
+              <w:left w:val="single" w:sz="4" w:space="0" w:color="7F7F7F"/>
+              <w:bottom w:val="single" w:sz="4" w:space="0" w:color="7F7F7F"/>
+              <w:right w:val="single" w:sz="4" w:space="0" w:color="7F7F7F"/>
+              <w:insideH w:val="single" w:sz="4" w:space="0" w:color="7F7F7F"/>
+              <w:insideV w:val="single" w:sz="4" w:space="0" w:color="7F7F7F"/>
+            </w:tcBorders>
+          </w:tcPr>
+          <w:p>
+            <w:pPr>
+              <w:spacing w:after="0" w:line="240" w:lineRule="auto"/>
+              <w:ind w:firstLine="0"/>
+            </w:pPr>
+            <w:r>
+              <w:rPr>
+                <w:rFonts w:ascii="Times New Roman" w:hAnsi="Times New Roman" w:eastAsia="Times New Roman"/>
+                <w:b w:val="0"/>
+                <w:i w:val="0"/>
+                <w:sz w:val="14"/>
+              </w:rPr>
+              <w:t>https://portal.inmet.gov.br/dadoshistoricos</w:t>
+            </w:r>
+          </w:p>
+        </w:tc>
+        <w:tc>
+          <w:tcPr>
+            <w:tcW w:type="dxa" w:w="2268"/>
+            <w:vAlign w:val="center"/>
+            <w:tcBorders>
+              <w:top w:val="single" w:sz="4" w:space="0" w:color="7F7F7F"/>
+              <w:left w:val="single" w:sz="4" w:space="0" w:color="7F7F7F"/>
+              <w:bottom w:val="single" w:sz="4" w:space="0" w:color="7F7F7F"/>
+              <w:right w:val="single" w:sz="4" w:space="0" w:color="7F7F7F"/>
+              <w:insideH w:val="single" w:sz="4" w:space="0" w:color="7F7F7F"/>
+              <w:insideV w:val="single" w:sz="4" w:space="0" w:color="7F7F7F"/>
+            </w:tcBorders>
+          </w:tcPr>
+          <w:p>
+            <w:pPr>
+              <w:spacing w:after="0" w:line="240" w:lineRule="auto"/>
+              <w:ind w:firstLine="0"/>
+            </w:pPr>
+            <w:r>
+              <w:rPr>
+                <w:rFonts w:ascii="Times New Roman" w:hAnsi="Times New Roman" w:eastAsia="Times New Roman"/>
+                <w:b w:val="0"/>
+                <w:i w:val="0"/>
+                <w:sz w:val="14"/>
+              </w:rPr>
+              <w:t>Precipitación, temperatura, humedad, radiación y viento agregados por año.</w:t>
+            </w:r>
+          </w:p>
+        </w:tc>
+      </w:tr>
+      <w:tr>
+        <w:tc>
+          <w:tcPr>
+            <w:tcW w:type="dxa" w:w="2268"/>
+            <w:vAlign w:val="center"/>
+            <w:tcBorders>
+              <w:top w:val="single" w:sz="4" w:space="0" w:color="7F7F7F"/>
+              <w:left w:val="single" w:sz="4" w:space="0" w:color="7F7F7F"/>
+              <w:bottom w:val="single" w:sz="4" w:space="0" w:color="7F7F7F"/>
+              <w:right w:val="single" w:sz="4" w:space="0" w:color="7F7F7F"/>
+              <w:insideH w:val="single" w:sz="4" w:space="0" w:color="7F7F7F"/>
+              <w:insideV w:val="single" w:sz="4" w:space="0" w:color="7F7F7F"/>
+            </w:tcBorders>
+          </w:tcPr>
+          <w:p>
+            <w:pPr>
+              <w:spacing w:after="0" w:line="240" w:lineRule="auto"/>
+              <w:ind w:firstLine="0"/>
+            </w:pPr>
+            <w:r>
+              <w:rPr>
+                <w:rFonts w:ascii="Times New Roman" w:hAnsi="Times New Roman" w:eastAsia="Times New Roman"/>
+                <w:b w:val="0"/>
+                <w:i w:val="0"/>
+                <w:sz w:val="14"/>
+              </w:rPr>
+              <w:t>Repositorio del experimento</w:t>
+            </w:r>
+          </w:p>
+        </w:tc>
+        <w:tc>
+          <w:tcPr>
+            <w:tcW w:type="dxa" w:w="2268"/>
+            <w:vAlign w:val="center"/>
+            <w:tcBorders>
+              <w:top w:val="single" w:sz="4" w:space="0" w:color="7F7F7F"/>
+              <w:left w:val="single" w:sz="4" w:space="0" w:color="7F7F7F"/>
+              <w:bottom w:val="single" w:sz="4" w:space="0" w:color="7F7F7F"/>
+              <w:right w:val="single" w:sz="4" w:space="0" w:color="7F7F7F"/>
+              <w:insideH w:val="single" w:sz="4" w:space="0" w:color="7F7F7F"/>
+              <w:insideV w:val="single" w:sz="4" w:space="0" w:color="7F7F7F"/>
+            </w:tcBorders>
+          </w:tcPr>
+          <w:p>
+            <w:pPr>
+              <w:spacing w:after="0" w:line="240" w:lineRule="auto"/>
+              <w:ind w:firstLine="0"/>
+            </w:pPr>
+            <w:r>
+              <w:rPr>
+                <w:rFonts w:ascii="Times New Roman" w:hAnsi="Times New Roman" w:eastAsia="Times New Roman"/>
+                <w:b w:val="0"/>
+                <w:i w:val="0"/>
+                <w:sz w:val="14"/>
+              </w:rPr>
+              <w:t>GitHub</w:t>
+            </w:r>
+          </w:p>
+        </w:tc>
+        <w:tc>
+          <w:tcPr>
+            <w:tcW w:type="dxa" w:w="2268"/>
+            <w:vAlign w:val="center"/>
+            <w:tcBorders>
+              <w:top w:val="single" w:sz="4" w:space="0" w:color="7F7F7F"/>
+              <w:left w:val="single" w:sz="4" w:space="0" w:color="7F7F7F"/>
+              <w:bottom w:val="single" w:sz="4" w:space="0" w:color="7F7F7F"/>
+              <w:right w:val="single" w:sz="4" w:space="0" w:color="7F7F7F"/>
+              <w:insideH w:val="single" w:sz="4" w:space="0" w:color="7F7F7F"/>
+              <w:insideV w:val="single" w:sz="4" w:space="0" w:color="7F7F7F"/>
+            </w:tcBorders>
+          </w:tcPr>
+          <w:p>
+            <w:pPr>
+              <w:spacing w:after="0" w:line="240" w:lineRule="auto"/>
+              <w:ind w:firstLine="0"/>
+            </w:pPr>
+            <w:r>
+              <w:rPr>
+                <w:rFonts w:ascii="Times New Roman" w:hAnsi="Times New Roman" w:eastAsia="Times New Roman"/>
+                <w:b w:val="0"/>
+                <w:i w:val="0"/>
+                <w:sz w:val="14"/>
+              </w:rPr>
+              <w:t>https://github.com/GabyQueiroz/CITREN_leite</w:t>
+            </w:r>
+          </w:p>
+        </w:tc>
+        <w:tc>
+          <w:tcPr>
+            <w:tcW w:type="dxa" w:w="2268"/>
+            <w:vAlign w:val="center"/>
+            <w:tcBorders>
+              <w:top w:val="single" w:sz="4" w:space="0" w:color="7F7F7F"/>
+              <w:left w:val="single" w:sz="4" w:space="0" w:color="7F7F7F"/>
+              <w:bottom w:val="single" w:sz="4" w:space="0" w:color="7F7F7F"/>
+              <w:right w:val="single" w:sz="4" w:space="0" w:color="7F7F7F"/>
+              <w:insideH w:val="single" w:sz="4" w:space="0" w:color="7F7F7F"/>
+              <w:insideV w:val="single" w:sz="4" w:space="0" w:color="7F7F7F"/>
+            </w:tcBorders>
+          </w:tcPr>
+          <w:p>
+            <w:pPr>
+              <w:spacing w:after="0" w:line="240" w:lineRule="auto"/>
+              <w:ind w:firstLine="0"/>
+            </w:pPr>
+            <w:r>
+              <w:rPr>
+                <w:rFonts w:ascii="Times New Roman" w:hAnsi="Times New Roman" w:eastAsia="Times New Roman"/>
+                <w:b w:val="0"/>
+                <w:i w:val="0"/>
+                <w:sz w:val="14"/>
+              </w:rPr>
+              <w:t>Código, base integrada, tablas, figuras y documento final.</w:t>
+            </w:r>
+          </w:p>
+        </w:tc>
+      </w:tr>
+    </w:tbl>
+    <w:p>
+      <w:pPr>
+        <w:spacing w:after="120" w:line="240" w:lineRule="auto"/>
+        <w:ind w:firstLine="0"/>
+      </w:pPr>
+    </w:p>
+    <w:p>
+      <w:pPr>
+        <w:jc w:val="center"/>
+      </w:pPr>
+      <w:r>
+        <w:rPr>
+          <w:rFonts w:ascii="Times New Roman" w:hAnsi="Times New Roman" w:eastAsia="Times New Roman"/>
+          <w:b w:val="0"/>
+          <w:i w:val="0"/>
+          <w:sz w:val="20"/>
+        </w:rPr>
+        <w:t>Tabla 1. Fuentes públicas, enlaces y función de cada fuente en el artículo.</w:t>
       </w:r>
     </w:p>
     <w:p>
@@ -1031,7 +1562,18 @@
           <w:i w:val="0"/>
           <w:sz w:val="20"/>
         </w:rPr>
-        <w:t>Tabla 1. Archivos locales utilizados para reproducir la base integrada, los algoritmos y los resultados.</w:t>
+        <w:t>Tabla 2. Archivos locales utilizados para reproducir la base integrada, los algoritmos y los resultados.</w:t>
+      </w:r>
+    </w:p>
+    <w:p>
+      <w:r>
+        <w:rPr>
+          <w:rFonts w:ascii="Times New Roman" w:hAnsi="Times New Roman" w:eastAsia="Times New Roman"/>
+          <w:b w:val="0"/>
+          <w:i w:val="0"/>
+          <w:sz w:val="20"/>
+        </w:rPr>
+        <w:t>Además del almacenamiento local, los códigos y salidas fueron enviados al repositorio GitHub https://github.com/GabyQueiroz/CITREN_leite. En el repositorio, la carpeta scripts contiene el archivo de procesamiento y modelado; la carpeta data contiene la base integrada y los datos tratados; la carpeta results contiene tablas y figuras; y la carpeta docs contiene el documento del artículo. Esta estructura facilita la auditoría del experimento, la repetición de los modelos y la actualización futura de los datos.</w:t>
       </w:r>
     </w:p>
     <w:p>
@@ -1067,7 +1609,7 @@
           <w:i w:val="0"/>
           <w:sz w:val="20"/>
         </w:rPr>
-        <w:t>La segunda base fue compuesta por datos meteorológicos horarios de la estación automática A819, localizada en Castro/PR y disponibilizada por el INMET. Fueron empleados registros de precipitación, temperatura del aire, humedad relativa, radiación solar global y velocidad del viento. Los datos fueron tratados para remover códigos de falla, valores nulos y registros incompatibles, además de convertir separadores decimales y formatos de fecha.</w:t>
+        <w:t>La segunda base fue compuesta por datos meteorológicos horarios de la estación automática A819, localizada en Castro/PR y disponibilizada por el INMET. Fueron empleados registros de precipitación, temperatura del aire, humedad relativa, radiación solar global y velocidad del viento. Los datos fueron tratados para remover códigos de falla, valores nulos y registros incompatibles, además de convertir separadores decimales, fechas y columnas numéricas.</w:t>
       </w:r>
     </w:p>
     <w:p>
@@ -1078,7 +1620,18 @@
           <w:i w:val="0"/>
           <w:sz w:val="20"/>
         </w:rPr>
-        <w:t>A partir de los datos horarios del INMET fueron generadas variables anuales: precipitación total acumulada, temperatura media anual, temperatura máxima observada, humedad relativa media, radicación solar media, velocidad media del viento y número aproximado de días secos, definidos como días con precipitación diaria inferior a 1 mm. Estas variables fueron integradas al panel municipal por año, funcionando como una señal agroclimática anual común para el estado.</w:t>
+        <w:t>A partir de los datos horarios del INMET fueron generadas variables anuales: precipitación total acumulada, temperatura media anual, temperatura máxima observada, humedad relativa media, radiación solar media, velocidad media del viento y número aproximado de días secos, definidos como días con precipitación diaria inferior a 1 mm. Estas variables fueron integradas al panel municipal por año, funcionando como una señal agroclimática anual común para el estado.</w:t>
+      </w:r>
+    </w:p>
+    <w:p>
+      <w:r>
+        <w:rPr>
+          <w:rFonts w:ascii="Times New Roman" w:hAnsi="Times New Roman" w:eastAsia="Times New Roman"/>
+          <w:b w:val="0"/>
+          <w:i w:val="0"/>
+          <w:sz w:val="20"/>
+        </w:rPr>
+        <w:t>La opción por una estación de Castro/PR fue adoptada por coherencia con el tema agrícola del estudio y por la disponibilidad de una serie horaria pública procesável. No obstante, esta elección también representa una limitación: el clima anual de una única estación no substituye una matriz espacial completa para todos los municipios. Por eso, los resultados deben ser entendidos como una prueba metodológica reproducible para congreso.</w:t>
       </w:r>
     </w:p>
     <w:p>
@@ -1447,7 +2000,7 @@
           <w:i w:val="0"/>
           <w:sz w:val="20"/>
         </w:rPr>
-        <w:t>Tabla 2. Variables utilizadas en la base final de modelado.</w:t>
+        <w:t>Tabla 3. Variables utilizadas en la base final de modelado.</w:t>
       </w:r>
     </w:p>
     <w:p>
@@ -1472,7 +2025,7 @@
           <w:i w:val="0"/>
           <w:sz w:val="20"/>
         </w:rPr>
-        <w:t>Los modelos fueron desarrollados en Python con pandas, scikit-learn, XGBoost y matplotlib. Para las variables numéricas se aplicó imputación por mediana y estandarización. Las variables categóricas asociadas al municipio fueron transformadas mediante one-hot encoding. La variable objetivo fue transformada por log(1 + y) en Random Forest y XGBoost, con retorno posterior a la escala original mediante exp(y) - 1.</w:t>
+        <w:t>Los modelos fueron desarrollados en Python con pandas, scikit-learn, XGBoost y matplotlib. Para las variables numéricas se aplicó imputación por mediana y estandarización. Las variables categóricas asociadas al municipio fueron transformadas mediante one-hot encoding, de modo que cada municipio pudiera ser representado sin imponer una relación ordinal artificial entre códigos.</w:t>
       </w:r>
     </w:p>
     <w:p>
@@ -1483,7 +2036,7 @@
           <w:i w:val="0"/>
           <w:sz w:val="20"/>
         </w:rPr>
-        <w:t>La separación de datos respetó la secuencia temporal. Los años hasta 2016 se utilizaron para entrenamiento, validación interna y selección de hiperparámetros; los años de 2017 a 2019 fueron reservados para la prueba final. Esta estrategia evita que observaciones futuras influyan en el entrenamiento y permite una evaluación más realista.</w:t>
+        <w:t>La variable objetivo fue transformada por log(1 + y) en Random Forest y XGBoost, con retorno posterior a la escala original mediante exp(y) - 1. Esta transformación fue utilizada porque la producción de leche presenta gran diferencia de escala entre municipios: algunos producen volúmenes muy altos, mientras otros poseen producción menor. La transformación logarítmica reduce la influencia excesiva de valores extremos durante el entrenamiento.</w:t>
       </w:r>
     </w:p>
     <w:p>
@@ -1494,7 +2047,18 @@
           <w:i w:val="0"/>
           <w:sz w:val="20"/>
         </w:rPr>
-        <w:t>Se compararon tres enfoques. El primero fue la persistencia lag-1, en la cual la predicción de un municipio en el año t es igual a la producción observada en el año t - 1. El segundo fue Random Forest Regressor, un ensamble de árboles de decisión capaz de modelar relaciones no lineales. El tercero fue XGBoost Regressor, basado en boosting de gradiente, que ajusta árboles secuenciales para reducir errores residuales.</w:t>
+        <w:t>La separación de datos respetó la secuencia temporal. Los años hasta 2016 se utilizaron para entrenamiento, validación interna y selección de hiperparámetros; los años de 2017 a 2019 fueron reservados para la prueba final. Esta estrategia evita que observaciones futuras influyan en el entrenamiento y permite una evaluación más realista que una partición aleatoria tradicional.</w:t>
+      </w:r>
+    </w:p>
+    <w:p>
+      <w:r>
+        <w:rPr>
+          <w:rFonts w:ascii="Times New Roman" w:hAnsi="Times New Roman" w:eastAsia="Times New Roman"/>
+          <w:b w:val="0"/>
+          <w:i w:val="0"/>
+          <w:sz w:val="20"/>
+        </w:rPr>
+        <w:t>Se compararon tres enfoques. El primero fue la persistencia lag-1, en la cual la predicción de un municipio en el año t es igual a la producción observada en el año t - 1. El segundo fue Random Forest Regressor, un ensamble de árboles de decisión capaz de modelar relaciones no lineales y interacciones entre variables. El tercero fue XGBoost Regressor, basado en boosting de gradiente, que ajusta árboles secuenciales para reducir errores residuales.</w:t>
       </w:r>
     </w:p>
     <w:tbl>
@@ -1885,7 +2449,7 @@
           <w:i w:val="0"/>
           <w:sz w:val="20"/>
         </w:rPr>
-        <w:t>Tabla 3. Algoritmos comparados y configuración final de hiperparámetros.</w:t>
+        <w:t>Tabla 4. Algoritmos comparados y configuración final de hiperparámetros.</w:t>
       </w:r>
     </w:p>
     <w:p>
@@ -1896,7 +2460,18 @@
           <w:i w:val="0"/>
           <w:sz w:val="20"/>
         </w:rPr>
-        <w:t>La selección de hiperparámetros fue realizada con GridSearchCV y validación cruzada temporal TimeSeriesSplit con tres divisiones. La métrica de optimización fue el menor RMSE. Para la evaluación final se calcularon MAE, RMSE, R² y MAPE, permitiendo analizar error absoluto, penalización de errores grandes, variabilidad explicada y error porcentual relativo.</w:t>
+        <w:t>La selección de hiperparámetros fue realizada con GridSearchCV y validación cruzada temporal TimeSeriesSplit con tres divisiones. La métrica de optimización fue el menor RMSE, ya que esta métrica penaliza con mayor intensidad errores grandes y es relevante cuando se desea evitar estimaciones muy distantes en municipios de alta producción.</w:t>
+      </w:r>
+    </w:p>
+    <w:p>
+      <w:r>
+        <w:rPr>
+          <w:rFonts w:ascii="Times New Roman" w:hAnsi="Times New Roman" w:eastAsia="Times New Roman"/>
+          <w:b w:val="0"/>
+          <w:i w:val="0"/>
+          <w:sz w:val="20"/>
+        </w:rPr>
+        <w:t>Para la evaluación final se calcularon cuatro métricas: MAE, que representa el error absoluto promedio; RMSE, que destaca errores de mayor magnitud; R², que mide la proporción de variabilidad explicada por el modelo; y MAPE, que expresa el error porcentual medio. El uso conjunto de estas métricas permite interpretar tanto la precisión en unidades productivas como la calidad relativa de las predicciones.</w:t>
       </w:r>
     </w:p>
     <w:p>
@@ -2549,7 +3124,7 @@
           <w:i w:val="0"/>
           <w:sz w:val="20"/>
         </w:rPr>
-        <w:t>Tabla 4. Desempeño de los modelos en la base de prueba de 2017 a 2019.</w:t>
+        <w:t>Tabla 5. Desempeño de los modelos en la base de prueba de 2017 a 2019.</w:t>
       </w:r>
     </w:p>
     <w:p>
@@ -2571,7 +3146,18 @@
           <w:i w:val="0"/>
           <w:sz w:val="20"/>
         </w:rPr>
-        <w:t>Entre los algoritmos de aprendizaje automático, Random Forest presentó el mejor desempeño general, con RMSE de 3.789,03 mil litros, MAE de 1.448,93 mil litros, R² de 0,9675 y MAPE de 22,64%. Aunque no superó el baseline de persistencia, el valor elevado de R² demuestra que el modelo capturó de forma consistente a estrutura produtiva dos municípios. El XGBoost obtuvo RMSE de 6.341,84 mil litros y R² de 0,9088, indicando mayor sensibilidad a la configuración de hiperparámetros y a la escala desigual entre municipios.</w:t>
+        <w:t>Entre los algoritmos de aprendizaje automático, Random Forest presentó el mejor desempeño general, con RMSE de 3.789,03 mil litros, MAE de 1.448,93 mil litros, R² de 0,9675 y MAPE de 22,64%. Aunque no superó el baseline de persistencia, el valor elevado de R² demuestra que el modelo capturó de forma consistente la estructura productiva de los municipios. El XGBoost obtuvo RMSE de 6.341,84 mil litros, R² de 0,9088 y MAPE de 24,12%, indicando mayor sensibilidad a la configuración de hiperparámetros y a la escala desigual entre municipios.</w:t>
+      </w:r>
+    </w:p>
+    <w:p>
+      <w:r>
+        <w:rPr>
+          <w:rFonts w:ascii="Times New Roman" w:hAnsi="Times New Roman" w:eastAsia="Times New Roman"/>
+          <w:b w:val="0"/>
+          <w:i w:val="0"/>
+          <w:sz w:val="20"/>
+        </w:rPr>
+        <w:t>La comparación con el modelo de persistencia es importante porque evita una interpretación exagerada de los algoritmos complejos. En problemas agrícolas con fuerte continuidad temporal, como la producción anual de leche, un baseline simple puede ser competitivo. Así, el resultado no invalida el uso de aprendizaje automático; al contrario, muestra que modelos como Random Forest y XGBoost deben ser comparados con referencias simples y ampliados con variables explicativas más ricas para justificar su aplicación operacional.</w:t>
       </w:r>
     </w:p>
     <w:p>
@@ -2628,6 +3214,17 @@
       </w:r>
     </w:p>
     <w:p>
+      <w:r>
+        <w:rPr>
+          <w:rFonts w:ascii="Times New Roman" w:hAnsi="Times New Roman" w:eastAsia="Times New Roman"/>
+          <w:b w:val="0"/>
+          <w:i w:val="0"/>
+          <w:sz w:val="20"/>
+        </w:rPr>
+        <w:t>La Figura 1 evidencia la diferencia de error cuadrático entre los tres enfoques. El menor RMSE fue observado en la persistencia lag-1, seguida por Random Forest. La distancia entre Random Forest y XGBoost sugiere que, con la configuración utilizada, el modelo de boosting fue menos estable para generalizar el comportamiento de los municipios en el período de prueba.</w:t>
+      </w:r>
+    </w:p>
+    <w:p>
       <w:pPr>
         <w:jc w:val="center"/>
       </w:pPr>
@@ -2681,6 +3278,17 @@
       </w:r>
     </w:p>
     <w:p>
+      <w:r>
+        <w:rPr>
+          <w:rFonts w:ascii="Times New Roman" w:hAnsi="Times New Roman" w:eastAsia="Times New Roman"/>
+          <w:b w:val="0"/>
+          <w:i w:val="0"/>
+          <w:sz w:val="20"/>
+        </w:rPr>
+        <w:t>La Figura 2 permite evaluar visualmente la proximidad entre valores observados y predichos. Puntos más próximos a la diagonal indican predicciones más acertadas. La concentración de puntos cerca de la diagonal confirma el alto R² obtenido, pero las dispersiones en municipios de producción elevada muestran dónde los errores absolutos se vuelven más relevantes.</w:t>
+      </w:r>
+    </w:p>
+    <w:p>
       <w:pPr>
         <w:jc w:val="center"/>
       </w:pPr>
@@ -2734,6 +3342,17 @@
       </w:r>
     </w:p>
     <w:p>
+      <w:r>
+        <w:rPr>
+          <w:rFonts w:ascii="Times New Roman" w:hAnsi="Times New Roman" w:eastAsia="Times New Roman"/>
+          <w:b w:val="0"/>
+          <w:i w:val="0"/>
+          <w:sz w:val="20"/>
+        </w:rPr>
+        <w:t>La Figura 3 contextualiza la dinámica temporal de los municipios líderes. La estabilidad de las trayectorias explica por qué las variables rezagadas tuvieron alto poder predictivo. También muestra que municipios con gran escala productiva pueden dominar el error absoluto, reforzando la necesidad de analizar simultáneamente RMSE, MAE y MAPE.</w:t>
+      </w:r>
+    </w:p>
+    <w:p>
       <w:pPr>
         <w:jc w:val="center"/>
       </w:pPr>
@@ -2786,6 +3405,17 @@
         <w:t>Figura 4. Importancia de variables del mejor modelo de aprendizaje automático.</w:t>
       </w:r>
     </w:p>
+    <w:p>
+      <w:r>
+        <w:rPr>
+          <w:rFonts w:ascii="Times New Roman" w:hAnsi="Times New Roman" w:eastAsia="Times New Roman"/>
+          <w:b w:val="0"/>
+          <w:i w:val="0"/>
+          <w:sz w:val="20"/>
+        </w:rPr>
+        <w:t>La Figura 4 muestra que la producción del año anterior fue la variable más influyente. Esto confirma que el componente histórico de la serie fue determinante. Las variables climáticas presentaron menor importancia relativa, probablemente por la agregación anual y por el uso de una única estación como señal regional.</w:t>
+      </w:r>
+    </w:p>
     <w:tbl>
       <w:tblPr>
         <w:tblW w:type="auto" w:w="0"/>
@@ -3476,7 +4106,7 @@
           <w:i w:val="0"/>
           <w:sz w:val="20"/>
         </w:rPr>
-        <w:t>Tabla 5. Diez variables más importantes en el modelo Random Forest.</w:t>
+        <w:t>Tabla 6. Diez variables más importantes en el modelo Random Forest.</w:t>
       </w:r>
     </w:p>
     <w:p>
@@ -3487,7 +4117,7 @@
           <w:i w:val="0"/>
           <w:sz w:val="20"/>
         </w:rPr>
-        <w:t>La variable más importante fue leite_lag_1, con importancia de 0,9564, seguida por leite_media_3anos y leite_lag_2. Esto confirma que la dinámica histórica de producción explica la mayor parte del comportamiento futuro. Las variables climáticas aparecieron con importancia menor, lo que puede estar relacionado con la escala anual del problema y con el uso de una única estación meteorológica como señal regional.</w:t>
+        <w:t>La variable más importante fue leite_lag_1, con importancia de 0,9564, seguida por leite_media_3anos y leite_lag_2. Esto confirma que la dinámica histórica de producción explica la mayor parte del comportamiento futuro. En términos prácticos, municipios que ya poseen trayectoria estable de producción tienden a mantener su posición relativa en el corto plazo, especialmente cuando la predicción se realiza en escala anual.</w:t>
       </w:r>
     </w:p>
     <w:p>
@@ -3498,7 +4128,7 @@
           <w:i w:val="0"/>
           <w:sz w:val="20"/>
         </w:rPr>
-        <w:t>Desde el punto de vista agrícola, el resultado es relevante porque muestra que bases públicas pueden apoyar estimaciones municipales de producción lechera con bajo costo computacional. Un sistema de este tipo puede auxiliar cooperativas, gestores públicos y laticinios en diagnósticos territoriales, planeamiento de demanda, identificación de municipios con mayor estabilidad productiva y construcción de escenarios preliminares para políticas de apoyo a la cadena del leite.</w:t>
+        <w:t>Las variables climáticas aparecieron con importancia menor, lo que puede estar relacionado con tres factores: la agregación anual reduce eventos extremos de corta duración; la estación A819 de Castro no representa toda la variabilidad espacial del Paraná; y la producción municipal de leche depende también de manejo, alimentación, rebaño, tecnología, mercado y políticas públicas, variables que no fueron incorporadas en esta versión.</w:t>
       </w:r>
     </w:p>
     <w:p>
@@ -3509,7 +4139,29 @@
           <w:i w:val="0"/>
           <w:sz w:val="20"/>
         </w:rPr>
-        <w:t>La comparación también revela un punto metodológico importante: cuando la serie histórica es muy fuerte, un algoritmo complejo no necesariamente supera un baseline temporal simple. Por eso, para estudios futuros, se recomienda ampliar la base con información espacialmente distribuida, como precipitación CHIRPS, cobertura de pastagens MapBiomas, relevo TOPODATA y características socioeconómicas o zootécnicas. Con esta ampliación, modelos más avançados, incluyendo aprendizaje profundo y técnicas de explicabilidad, pueden tener mayor potencial de contribuir con predicciones robustas.</w:t>
+        <w:t>Desde el punto de vista agrícola, el resultado es relevante porque muestra que bases públicas pueden apoyar estimaciones municipales de producción lechera con bajo costo computacional. Un sistema de este tipo puede auxiliar cooperativas, gestores públicos e industrias lácteas en diagnósticos territoriales, planeamiento de demanda, identificación de municipios con mayor estabilidad productiva y construcción de escenarios preliminares para políticas de apoyo a la cadena de leche.</w:t>
+      </w:r>
+    </w:p>
+    <w:p>
+      <w:r>
+        <w:rPr>
+          <w:rFonts w:ascii="Times New Roman" w:hAnsi="Times New Roman" w:eastAsia="Times New Roman"/>
+          <w:b w:val="0"/>
+          <w:i w:val="0"/>
+          <w:sz w:val="20"/>
+        </w:rPr>
+        <w:t>La comparación también revela un punto metodológico importante: cuando la serie histórica es muy fuerte, un algoritmo complejo no necesariamente supera un baseline temporal simple. Por eso, para estudios futuros, se recomienda ampliar la base con información espacialmente distribuida, como precipitación CHIRPS, cobertura de pasturas MapBiomas, relevo TOPODATA y características socioeconómicas o zootécnicas. Con esta ampliación, modelos más avanzados, incluyendo aprendizaje profundo y técnicas de explicabilidad, pueden tener mayor potencial de contribuir con predicciones robustas.</w:t>
+      </w:r>
+    </w:p>
+    <w:p>
+      <w:r>
+        <w:rPr>
+          <w:rFonts w:ascii="Times New Roman" w:hAnsi="Times New Roman" w:eastAsia="Times New Roman"/>
+          <w:b w:val="0"/>
+          <w:i w:val="0"/>
+          <w:sz w:val="20"/>
+        </w:rPr>
+        <w:t>Como aplicación futura, el modelo puede evolucionar hacia un sistema de apoyo a la decisión para agricultura de precisión territorial. La integración con bases geoespaciales permitiría identificar regiones con mayor riesgo climático, estimar impactos de sequías o exceso de lluvia y comparar escenarios de producción municipal. Para una tesis de maestría, el principal avance sería pasar de una predicción tabular simplificada hacia una fusión de datos agropecuarios, climáticos y geoespaciales con explicabilidad.</w:t>
       </w:r>
     </w:p>
     <w:p>
@@ -3670,6 +4322,12 @@
     </w:p>
     <w:p>
       <w:pPr>
+        <w:spacing w:after="120" w:line="240" w:lineRule="auto"/>
+        <w:ind w:firstLine="425"/>
+      </w:pPr>
+    </w:p>
+    <w:p>
+      <w:pPr>
         <w:spacing w:after="60" w:line="240" w:lineRule="auto"/>
         <w:ind w:firstLine="0"/>
       </w:pPr>
@@ -3689,7 +4347,7 @@
     <w:p>
       <w:pPr>
         <w:spacing w:after="120" w:line="240" w:lineRule="auto"/>
-        <w:ind w:firstLine="425"/>
+        <w:ind w:firstLine="0"/>
       </w:pPr>
     </w:p>
     <w:p>
@@ -3700,12 +4358,36 @@
     </w:p>
     <w:p>
       <w:pPr>
+        <w:spacing w:after="60" w:line="240" w:lineRule="auto"/>
+        <w:ind w:firstLine="0"/>
+      </w:pPr>
+    </w:p>
+    <w:p>
+      <w:pPr>
         <w:spacing w:after="120" w:line="240" w:lineRule="auto"/>
         <w:ind w:firstLine="425"/>
       </w:pPr>
     </w:p>
     <w:p>
       <w:pPr>
+        <w:spacing w:after="120" w:line="240" w:lineRule="auto"/>
+        <w:ind w:firstLine="425"/>
+      </w:pPr>
+    </w:p>
+    <w:p>
+      <w:pPr>
+        <w:spacing w:after="120" w:line="240" w:lineRule="auto"/>
+        <w:ind w:firstLine="425"/>
+      </w:pPr>
+    </w:p>
+    <w:p>
+      <w:pPr>
+        <w:spacing w:after="120" w:line="240" w:lineRule="auto"/>
+        <w:ind w:firstLine="425"/>
+      </w:pPr>
+    </w:p>
+    <w:p>
+      <w:pPr>
         <w:spacing w:after="60" w:line="240" w:lineRule="auto"/>
         <w:ind w:firstLine="0"/>
       </w:pPr>
@@ -3755,6 +4437,12 @@
     <w:p>
       <w:pPr>
         <w:spacing w:after="120" w:line="240" w:lineRule="auto"/>
+        <w:ind w:firstLine="425"/>
+      </w:pPr>
+    </w:p>
+    <w:p>
+      <w:pPr>
+        <w:spacing w:after="120" w:line="240" w:lineRule="auto"/>
         <w:ind w:firstLine="0"/>
       </w:pPr>
     </w:p>
@@ -3767,6 +4455,12 @@
     <w:p>
       <w:pPr>
         <w:spacing w:after="120" w:line="240" w:lineRule="auto"/>
+        <w:ind w:firstLine="425"/>
+      </w:pPr>
+    </w:p>
+    <w:p>
+      <w:pPr>
+        <w:spacing w:after="120" w:line="240" w:lineRule="auto"/>
         <w:ind w:firstLine="0"/>
       </w:pPr>
     </w:p>
@@ -3784,6 +4478,12 @@
     </w:p>
     <w:p>
       <w:pPr>
+        <w:spacing w:after="120" w:line="240" w:lineRule="auto"/>
+        <w:ind w:firstLine="425"/>
+      </w:pPr>
+    </w:p>
+    <w:p>
+      <w:pPr>
         <w:spacing w:after="60" w:line="240" w:lineRule="auto"/>
         <w:ind w:firstLine="0"/>
       </w:pPr>
@@ -3796,6 +4496,12 @@
     </w:p>
     <w:p>
       <w:pPr>
+        <w:spacing w:after="120" w:line="240" w:lineRule="auto"/>
+        <w:ind w:firstLine="425"/>
+      </w:pPr>
+    </w:p>
+    <w:p>
+      <w:pPr>
         <w:spacing w:after="60" w:line="240" w:lineRule="auto"/>
         <w:ind w:firstLine="0"/>
       </w:pPr>
@@ -3808,6 +4514,12 @@
     </w:p>
     <w:p>
       <w:pPr>
+        <w:spacing w:after="120" w:line="240" w:lineRule="auto"/>
+        <w:ind w:firstLine="425"/>
+      </w:pPr>
+    </w:p>
+    <w:p>
+      <w:pPr>
         <w:spacing w:after="60" w:line="240" w:lineRule="auto"/>
         <w:ind w:firstLine="0"/>
       </w:pPr>
@@ -3820,6 +4532,12 @@
     </w:p>
     <w:p>
       <w:pPr>
+        <w:spacing w:after="120" w:line="240" w:lineRule="auto"/>
+        <w:ind w:firstLine="425"/>
+      </w:pPr>
+    </w:p>
+    <w:p>
+      <w:pPr>
         <w:spacing w:after="60" w:line="240" w:lineRule="auto"/>
         <w:ind w:firstLine="0"/>
       </w:pPr>
@@ -3833,7 +4551,25 @@
     <w:p>
       <w:pPr>
         <w:spacing w:after="120" w:line="240" w:lineRule="auto"/>
+        <w:ind w:firstLine="425"/>
+      </w:pPr>
+    </w:p>
+    <w:p>
+      <w:pPr>
+        <w:spacing w:after="120" w:line="240" w:lineRule="auto"/>
         <w:ind w:firstLine="0"/>
+      </w:pPr>
+    </w:p>
+    <w:p>
+      <w:pPr>
+        <w:spacing w:after="120" w:line="240" w:lineRule="auto"/>
+        <w:ind w:firstLine="425"/>
+      </w:pPr>
+    </w:p>
+    <w:p>
+      <w:pPr>
+        <w:spacing w:after="120" w:line="240" w:lineRule="auto"/>
+        <w:ind w:firstLine="425"/>
       </w:pPr>
     </w:p>
     <w:p>

</xml_diff>